<commit_message>
⚡ Bolt: [performance improvement] cache MC namespaces
</commit_message>
<xml_diff>
--- a/examples/adoption/12-comments/review-2/clean.docx
+++ b/examples/adoption/12-comments/review-2/clean.docx
@@ -12,13 +12,7 @@
     </w:p>
     <w:p>
       <w:r>
-        <w:t xml:space="preserve">This Non-Disclosure Agreement (the "Agreement") is entered into by</w:t>
-      </w:r>
-      <w:r>
-        <w:t xml:space="preserve"> </w:t>
-      </w:r>
-      <w:r>
-        <w:t xml:space="preserve">Meridian Labs Inc. ("Discloser") and Harbor Tools GmbH ("Recipient").</w:t>
+        <w:t xml:space="preserve">This Non-Disclosure Agreement (the "Agreement") is entered into by Meridian Labs Inc. ("Discloser") and Harbor Tools GmbH ("Recipient").</w:t>
       </w:r>
     </w:p>
     <w:p>
@@ -31,25 +25,7 @@
     </w:p>
     <w:p>
       <w:r>
-        <w:t xml:space="preserve">"Confidential Information" means any information disclosed by Discloser</w:t>
-      </w:r>
-      <w:r>
-        <w:t xml:space="preserve"> </w:t>
-      </w:r>
-      <w:r>
-        <w:t xml:space="preserve">to Recipient, in any form, that is marked confidential or that</w:t>
-      </w:r>
-      <w:r>
-        <w:t xml:space="preserve"> </w:t>
-      </w:r>
-      <w:r>
-        <w:t xml:space="preserve">reasonably should be understood to be confidential given the nature of</w:t>
-      </w:r>
-      <w:r>
-        <w:t xml:space="preserve"> </w:t>
-      </w:r>
-      <w:r>
-        <w:t xml:space="preserve">the information and the disclosure.</w:t>
+        <w:t xml:space="preserve">"Confidential Information" means any information disclosed by Discloser to Recipient, in any form, that is marked confidential or that reasonably should be understood to be confidential given the nature of the information and the disclosure.</w:t>
       </w:r>
     </w:p>
     <w:p>
@@ -62,13 +38,7 @@
     </w:p>
     <w:p>
       <w:r>
-        <w:t xml:space="preserve">Recipient shall hold all Confidential Information in strict confidence</w:t>
-      </w:r>
-      <w:r>
-        <w:t xml:space="preserve"> </w:t>
-      </w:r>
-      <w:r>
-        <w:t xml:space="preserve">and shall:</w:t>
+        <w:t xml:space="preserve">Recipient shall hold all Confidential Information in strict confidence and shall:</w:t>
       </w:r>
     </w:p>
     <w:p>
@@ -114,13 +84,7 @@
       <w:commentRangeStart w:id="0"/>
       <w:commentRangeStart w:id="1"/>
       <w:r>
-        <w:t xml:space="preserve">who</w:t>
-      </w:r>
-      <w:r>
-        <w:t xml:space="preserve"> </w:t>
-      </w:r>
-      <w:r>
-        <w:t xml:space="preserve">need it for the Permitted Purpose</w:t>
+        <w:t xml:space="preserve">who need it for the Permitted Purpose</w:t>
       </w:r>
       <w:commentRangeEnd w:id="0"/>
       <w:commentRangeEnd w:id="1"/>
@@ -131,13 +95,7 @@
         <w:commentReference w:id="1"/>
       </w:r>
       <w:r>
-        <w:t xml:space="preserve">, provided each employee signs a</w:t>
-      </w:r>
-      <w:r>
-        <w:t xml:space="preserve"> </w:t>
-      </w:r>
-      <w:r>
-        <w:t xml:space="preserve">confidentiality agreement at least as protective as this Agreement.</w:t>
+        <w:t xml:space="preserve">, provided each employee signs a confidentiality agreement at least as protective as this Agreement.</w:t>
       </w:r>
     </w:p>
     <w:p>

</xml_diff>